<commit_message>
Satin 6 feedback: correct the above-bound rows in the queen size sheet set silk campaign
The engine flags two keywords above the $2.89 bound: row 48 at $3.47
and row 49 at $3.40. Rows 45 (the campaign's top-of-search boost) and
50 (a third keyword at $2.31) are held with them.

Co-Authored-By: Claude Opus 5.5 <noreply@anthropic.com>
Claude-Session: https://claude.ai/code/session_01YNgDp4Dr6K8rA49jFuXt44
</commit_message>
<xml_diff>
--- a/satin6_deliverables/Satin6_US_audit_20260929_feedback.docx
+++ b/satin6_deliverables/Satin6_US_audit_20260929_feedback.docx
@@ -7232,7 +7232,7 @@
         </w:numPr>
       </w:pPr>
       <w:r>
-        <w:t xml:space="preserve">45, 48, 49 and 50 ("queen size sheet set silk", $3.47 against a $2.89 bound);</w:t>
+        <w:t xml:space="preserve">45, 48, 49 and 50, the "queen size sheet set silk" campaign: the engine flags two keywords above its $2.89 bound, "queen sheets set silk" at $3.47 (row 48) and "queen size sheet set silk" at $3.40 (row 49). Row 45 is the campaign's top-of-search boost and row 50 a third keyword at $2.31, held with them;</w:t>
       </w:r>
     </w:p>
     <w:p>
@@ -14476,7 +14476,7 @@
                 <w:sz w:val="17"/>
                 <w:szCs w:val="17"/>
               </w:rPr>
-              <w:t xml:space="preserve">45/48/49/50 at $3.47 against a $2.89 bound; 110 at $2.48 against $2.30; plus 8 engine-held</w:t>
+              <w:t xml:space="preserve">48 at $3.47 and 49 at $3.40 against a $2.89 bound (45 and 50 held with them); 110 at $2.48 against $2.30; plus 8 engine-held</w:t>
             </w:r>
           </w:p>
         </w:tc>

</xml_diff>

<commit_message>
Satin 6 feedback: rename basis, Striped Red King stop rule, White rates, 6 Oct grades
- State the basis for the 192 wrong renames (86 swap targets that won't
  load, 42 not the advertised child, 63 children that break the size or
  colour rule, 1 wrong objective).
- Striped Red King re-point: pause at 20 clicks with no order.
- White sells 0, 6 and 1 units a month (Queen, Full, Twin), as in the
  engine's stock table.
- 19 predictions also grade on 6 Oct, the first day of Prime Big Deal Days.
- Issue 8: row 90 cuts a term at #11 as 'not moving' with no earlier rank.

Co-Authored-By: Claude Opus 5.5 <noreply@anthropic.com>
Claude-Session: https://claude.ai/code/session_01YNgDp4Dr6K8rA49jFuXt44
</commit_message>
<xml_diff>
--- a/satin6_deliverables/Satin6_US_audit_20260929_feedback.docx
+++ b/satin6_deliverables/Satin6_US_audit_20260929_feedback.docx
@@ -154,7 +154,7 @@
         </w:numPr>
       </w:pPr>
       <w:r>
-        <w:t xml:space="preserve">The engine's "hero" for Queen, Full and Twin is White by rule, although White sells 1, 6 and 0 units a month against Black's 67–74, 24–25 and 12–13.</w:t>
+        <w:t xml:space="preserve">The engine's "hero" for Queen, Full and Twin is White by rule, although White sells 0, 6 and 1 units a month (the engine’s own stock table) against Black's 67–74, 24–25 and 12–13.</w:t>
       </w:r>
     </w:p>
     <w:p>
@@ -204,7 +204,7 @@
         <w:t xml:space="preserve">The deal calendar isn't read.</w:t>
       </w:r>
       <w:r>
-        <w:t xml:space="preserve"> Lightning Deals fall on 30 Sep, 7 Oct (Prime Big Deal Days), 12, 24 and 30 Oct. 29 predictions grade on 7 Oct.</w:t>
+        <w:t xml:space="preserve"> Lightning Deals fall on 30 Sep, 7 Oct (Prime Big Deal Days), 12, 24 and 30 Oct. 19 predictions grade on 6 Oct and 29 on 7 Oct, both Prime Big Deal Days.</w:t>
       </w:r>
     </w:p>
     <w:p>
@@ -3084,7 +3084,7 @@
                 <w:sz w:val="17"/>
                 <w:szCs w:val="17"/>
               </w:rPr>
-              <w:t xml:space="preserve">None of the 86 swaps loads; the 323 renames would. 192 of the new names would state a wrong child or objective.</w:t>
+              <w:t xml:space="preserve">None of the 86 swaps loads; the 323 renames would. 192 of the new names would state a wrong child or objective (if the audit loads as written: 86 name a swap target that won’t load, 42 name a SKU that isn’t the campaign’s advertised child, 63 name a child that breaks the size or colour rule, and 1 states the wrong objective).</w:t>
             </w:r>
           </w:p>
         </w:tc>
@@ -3302,7 +3302,7 @@
                 <w:sz w:val="17"/>
                 <w:szCs w:val="17"/>
               </w:rPr>
-              <w:t xml:space="preserve">Not read; 29 predictions grade on 7 Oct</w:t>
+              <w:t xml:space="preserve">Not read; 19 predictions grade on 6 Oct and 29 on 7 Oct (Prime Big Deal Days)</w:t>
             </w:r>
           </w:p>
         </w:tc>
@@ -3520,7 +3520,7 @@
                 <w:sz w:val="17"/>
                 <w:szCs w:val="17"/>
               </w:rPr>
-              <w:t xml:space="preserve">Every ranking-term cut cites "Maintenance Profit Control", class HARD, −25% at the top of search. Targets the run won't fund still trigger cuts ("far from target and not moving").</w:t>
+              <w:t xml:space="preserve">Every ranking-term cut cites "Maintenance Profit Control", class HARD, −25% at the top of search. Targets the run won't fund still trigger cuts ("far from target and not moving"). Row 90 cuts "silk sheets king size bed set" 25% as "far from target (#11 vs #5) and not moving (— → 11)", with no earlier rank to compare.</w:t>
             </w:r>
           </w:p>
         </w:tc>
@@ -8856,7 +8856,7 @@
                 <w:sz w:val="17"/>
                 <w:szCs w:val="17"/>
               </w:rPr>
-              <w:t xml:space="preserve">"red satin sheets king", "red satin king size sheet set" → Striped Red King at a $0.80 bid, $5–7 a day, read at 20 clicks. Switch back when plain Red King is restocked.</w:t>
+              <w:t xml:space="preserve">"red satin sheets king", "red satin king size sheet set" → Striped Red King at a $0.80 bid, $5–7 a day, pause at 20 clicks with no order. Switch back when plain Red King is restocked.</w:t>
             </w:r>
           </w:p>
         </w:tc>
@@ -14175,7 +14175,7 @@
                 <w:sz w:val="17"/>
                 <w:szCs w:val="17"/>
               </w:rPr>
-              <w:t xml:space="preserve">Re-point at $0.80, $5–7 a day, read at 20 clicks; treat striped red as red in the colour map</w:t>
+              <w:t xml:space="preserve">Re-point at $0.80, $5–7 a day, pause at 20 clicks with no order; treat striped red as red in the colour map</w:t>
             </w:r>
           </w:p>
         </w:tc>

</xml_diff>